<commit_message>
docs: sync release and implementation status
</commit_message>
<xml_diff>
--- a/SmartVPN_Windows_Android_开发文档.docx
+++ b/SmartVPN_Windows_Android_开发文档.docx
@@ -12,12 +12,12 @@
     </w:p>
     <w:p>
       <w:r>
-        <w:t>版本 1.0　｜　2026 年 9 月 24 日　｜　目标：独立客户端，Mihomo 内核</w:t>
+        <w:t>版本 1.1　｜　更新于 2026 年 10 月 29 日　｜　对应软件版本：0.1.1　｜　目标：独立客户端，Mihomo 内核</w:t>
       </w:r>
     </w:p>
     <w:p>
       <w:r>
-        <w:t>本文将双平台需求转化为模块边界、实现顺序和可验证的交付标准。先交付 Windows 系统代理版，再完成严格地区保护所需的 TUN 路径，最后移植 Android。具体版本和接口以实施时锁定的依赖版本为准。</w:t>
+        <w:t>本文保留双平台需求与架构基线，并补入截至 2026 年 10 月 29 日的实际实现和验收状态。系统使用 Flutter 前端、共享 Go 服务与 Mihomo；Windows 使用系统代理或 TUN，Android 使用 VpnService。第 8 节区分已实现内容与尚未完成的验收。</w:t>
       </w:r>
     </w:p>
     <w:p>
@@ -417,7 +417,7 @@
           </w:tcPr>
           <w:p>
             <w:r>
-              <w:t>id、URL、更新时间、刷新间隔、配置摘要、错误状态</w:t>
+              <w:t>id、来源 URL、名称、启用状态、节点前缀、独立缓存、最近刷新错误、Subscription-Userinfo 配额与更新时间</w:t>
             </w:r>
           </w:p>
         </w:tc>
@@ -514,7 +514,7 @@
     <w:p/>
     <w:p>
       <w:r>
-        <w:t>订阅原文和凭据不得出现在普通日志。节点稳定 id 可由订阅来源和非敏感节点标识生成；订阅刷新时保留用户规则，重建候选池并重新验证出口地区。</w:t>
+        <w:t>订阅原文和凭据不得出现在普通日志。节点稳定 id 由订阅来源和非敏感节点标识生成；刷新单个来源时保留其独立缓存和配额信息，不覆盖当前运行配置或地区验证状态。</w:t>
       </w:r>
     </w:p>
     <w:p>
@@ -760,7 +760,7 @@
     <w:p/>
     <w:p>
       <w:r>
-        <w:t>初始建议：连接检测 3 秒、巡检 30 秒、2 次失败确认、60 秒冷却、30 秒最短驻留、3 次成功恢复。这是可配置参数，必须在真实网络中校准。切换通常只影响新连接；现有 TCP 会话可能断开，不能自动重放有副作用的请求。</w:t>
+        <w:t>设计基线建议连接检测 3 秒、巡检 30 秒、2 次失败确认、60 秒冷却、30 秒最短驻留、3 次成功恢复。当前巡检间隔为 60 秒：Mihomo 的批量延迟接口会测量整个节点组，降低频率可避免对用户线路和订阅探测额度造成持续负担。连续失败仍须独立流量探测确认；同地区节点耗尽后才进入 REJECT。以上参数可配置，需结合实际网络继续校准。</w:t>
       </w:r>
     </w:p>
     <w:p>
@@ -778,12 +778,12 @@
     </w:p>
     <w:p>
       <w:r>
-        <w:t>网站规则按域名优先、IP 规则补充，匹配到独立 PolicyGroup。Windows 的应用规则在 TUN 阶段通过可验证的进程识别能力实现。Android 的 VpnService 允许按包名决定哪些应用进入 VPN；若要让不同应用在隧道内使用不同节点，仍需可靠的每条流量归属机制，必须单独验证，不可将允许名单当作完整的应用级路由。</w:t>
+        <w:t>网站规则按域名优先、IP 规则补充，匹配到独立 PolicyGroup。当前策略以域名、IP 和地区为主；Windows TUN 可识别连接进程用于监控，但尚未实现按应用选择不同代理节点。Android VpnService 可决定哪些包进入 VPN；在隧道内按每条连接分配不同节点仍未实现，不能把包名允许列表当成完整的应用级路由。</w:t>
       </w:r>
     </w:p>
     <w:p>
       <w:r>
-        <w:t>订阅定时刷新必须限制响应大小和超时、验证配置结构、隔离用户私密 URL、避免远程配置覆盖本机控制接口、DIRECT 禁令与地区策略。解析失败保留上一份可用配置并提示错误。</w:t>
+        <w:t>订阅定时刷新必须限制响应大小和超时、验证配置结构、隔离用户私密 URL、避免远程配置覆盖本机控制接口和地区策略；解析失败时保留上一份可用配置并提示错误。当前实现支持多个订阅源合并为一个节点列表，每个来源保留独立缓存、前缀和用量数据；连接中可单独读取 Subscription-Userinfo 响应头刷新已用量和总量，不重载当前节点配置。没有返回该响应头的服务无法提供配额刷新。</w:t>
       </w:r>
     </w:p>
     <w:p>
@@ -804,7 +804,7 @@
     </w:p>
     <w:p>
       <w:r>
-        <w:t>第一阶段以独立 Mihomo 进程和系统代理工作。启动前检查配置；崩溃后检测进程与代理设置；退出时仅恢复由本客户端修改的设置。后续增加 TUN、DNS 与 IPv4/IPv6 路径检查，验证无绕过。严格全设备保护必须在 TUN 与系统路由或防火墙保护通过后才能在 UI 中声明。</w:t>
+        <w:t>Windows 系统代理与 TUN 均已实现。系统代理断开或正常退出时，仅在系统值仍与 SmartVPN 写入值一致时恢复备份；TUN 使用 Mihomo 与 wintun，配置 fake-ip、DNS 劫持和 IPv4 优先解析。连接页可检查适配器、默认路由、DNS 与无代理出口。Windows TUN 不是独立防火墙，按应用选择不同节点尚未实现。</w:t>
       </w:r>
     </w:p>
     <w:p>
@@ -817,7 +817,7 @@
     </w:p>
     <w:p>
       <w:r>
-        <w:t>Kotlin 负责 VpnService 授权、TUN 创建与前台服务生命周期；代理出站套接字需避免再次进入 VPN 造成回环。验证断网、切换 Wi-Fi 与移动网络、后台恢复、省电限制、IPv6 与 DNS。Go/Mihomo 以可调用库形式适配，接口设计预留配置、TUN fd、网络变化、状态事件和安全关闭。</w:t>
+        <w:t>Kotlin VpnService 负责授权、TUN 文件描述符交接与前台服务生命周期；Go 服务以 c-shared 库嵌入，构建使用 cmfa 与 with_gvisor。应用自身不进入 VPN，内核出站套接字受保护；连接状态会检查 TUN 监听器和系统下发的路由。当前 v0.1.1 提供 ARM64 APK，连接路径已验证；后台长时运行、网络切换与地区锁定仍需按第 9 节矩阵记录完整验收结果。</w:t>
       </w:r>
     </w:p>
     <w:p>
@@ -876,7 +876,7 @@
               <w:rPr>
                 <w:b/>
               </w:rPr>
-              <w:t>验收</w:t>
+              <w:t>当前实现与验收状态</w:t>
             </w:r>
           </w:p>
         </w:tc>
@@ -908,7 +908,7 @@
           </w:tcPr>
           <w:p>
             <w:r>
-              <w:t>通过测试订阅访问网络；断开后恢复原代理设置</w:t>
+              <w:t>已实现并随 v0.1.1 发布；连接、断开及仅恢复本程序写入值的路径已实现。</w:t>
             </w:r>
           </w:p>
         </w:tc>
@@ -940,7 +940,7 @@
           </w:tcPr>
           <w:p>
             <w:r>
-              <w:t>故障切到同地区；全部失败时不跨地区，代理请求失败关闭</w:t>
+              <w:t>已实现健康状态机和同地区切换；巡检为 60 秒，连续失败后经独立流量探测确认。</w:t>
             </w:r>
           </w:p>
         </w:tc>
@@ -972,7 +972,7 @@
           </w:tcPr>
           <w:p>
             <w:r>
-              <w:t>测试应用分流；内核故障、重启及 DNS 情况不泄漏受保护流量</w:t>
+              <w:t>已实现 Windows TUN、DNS/路由检查和无代理出口检查；按应用选择不同节点仍未实现。</w:t>
             </w:r>
           </w:p>
         </w:tc>
@@ -1004,7 +1004,7 @@
           </w:tcPr>
           <w:p>
             <w:r>
-              <w:t>真机建立 VPN；锁定生效；后台和网络切换后可恢复</w:t>
+              <w:t>已实现 VpnService、嵌入式 Go 服务与共享 Flutter 页面；ARM64 APK 已构建，连接路径已验证。后台、网络切换和地区锁定的完整验收记录仍待补齐。</w:t>
             </w:r>
           </w:p>
         </w:tc>
@@ -1036,7 +1036,7 @@
           </w:tcPr>
           <w:p>
             <w:r>
-              <w:t>双端同一组规则样例通过，文档与许可审查完成</w:t>
+              <w:t>v0.1.1 Windows 便携包与 Android APK 已发布；日志脱敏、许可审查和性能基线已完成。双端同一组规则样例尚未完成验收，因此 M5 尚未签收。</w:t>
             </w:r>
           </w:p>
         </w:tc>
@@ -1045,7 +1045,7 @@
     <w:p/>
     <w:p>
       <w:r>
-        <w:t>工期按人员、现成内核封装、测试设备与签名流程重新估算；此前 9 至 15 周只是粗略规划，不构成承诺。</w:t>
+        <w:t>原 9 至 15 周为早期规划，不代表当前进度或交付承诺。v0.1.1 的发布构建已完成；发布包本身不替代跨平台验收。</w:t>
       </w:r>
     </w:p>
     <w:p>
@@ -1058,7 +1058,7 @@
     </w:p>
     <w:p>
       <w:r>
-        <w:t>至少覆盖：节点故障及恢复；同地区全部不可用；地区信息过期或冲突；订阅更新移除当前节点；多个策略组互不影响；DNS、IPv4 与 IPv6 出口；进程异常退出；睡眠唤醒；Android 后台与 Wi-Fi/移动网络切换。将“出口地区不变”“受保护流量不直连”作为可观测断言，并记录网络抓包或测试服务结果。</w:t>
+        <w:t>至少覆盖：节点故障及恢复；同地区全部不可用；地区信息过期或冲突；订阅更新移除当前节点；多个策略组互不影响；DNS、IPv4 与 IPv6 出口；进程异常退出；睡眠唤醒；Android 后台与 Wi-Fi/移动网络切换。将“出口地区不变”“受保护流量不直连”作为可观测断言，并记录网络抓包或测试服务结果。M5 的最终验收还要求 Windows 与 Android 对同一组规则样例得到一致结果；截至本次修订，该项仍未签收。</w:t>
       </w:r>
     </w:p>
     <w:p>
@@ -1071,7 +1071,7 @@
     </w:p>
     <w:p>
       <w:r>
-        <w:t>风险包括 Mihomo 控制 API 的事件粒度、移动端内核封装适配、Android 流量归属、Windows 系统代理覆盖不足、出口地理库误差及依赖再分发许可。每项应在对应里程碑中做最小验证，再决定是否维护内核分支。</w:t>
+        <w:t>当前风险包括 Mihomo 控制 API 的事件粒度、Android 按连接归属应用及隧道内多节点路由、Windows 多实例对同一 TUN 适配器的冲突、出口地理库误差及依赖再分发许可。Android v0.1.1 APK 使用项目现有调试签名，适合侧载，不是应用商店签名。所有风险应在对应验收项中验证后再决定是否维护内核分支。</w:t>
       </w:r>
     </w:p>
     <w:p>
@@ -1826,9 +1826,6 @@
     <w:qFormat/>
     <w:rsid w:val="00FC693F"/>
     <w:pPr>
-      <w:pBdr>
-        <w:bottom w:val="single" w:sz="8" w:space="4" w:color="4F81BD" w:themeColor="accent1"/>
-      </w:pBdr>
       <w:spacing w:after="120" w:line="240" w:lineRule="auto" w:before="260"/>
       <w:contextualSpacing/>
     </w:pPr>

</xml_diff>